<commit_message>
Show app description only after flying through Operator DNG title
</commit_message>
<xml_diff>
--- a/presentation/operator-dng-updated/Speaker_Notes.docx
+++ b/presentation/operator-dng-updated/Speaker_Notes.docx
@@ -20,7 +20,7 @@
     </w:p>
     <w:p>
       <w:r>
-        <w:t>Оператор ДНГ — кроссплатформенное приложение для Android и iOS, для работников Общества и подрядных организаций. Вступление встроено в PPTX, 9 секунд, запуск автоматический; при необходимости щёлкните по изображению. После окончания продолжите показ стрелкой вправо. Иллюстрация промысла создана ИИ. В Microsoft PowerPoint фактическое воспроизведение не проверено.</w:t>
+        <w:t>В начале — только название «ОПЕРАТОР ДНГ», затем пролёт сквозь букву. Пояснение о кроссплатформенном приложении для Android и iOS, работников Общества и подрядных организаций появляется после раскрытия промысла. Ролик встроен в PPTX. Реальное воспроизведение в Microsoft PowerPoint здесь не проверено.</w:t>
       </w:r>
     </w:p>
     <w:p>
@@ -98,12 +98,7 @@
     </w:p>
     <w:p>
       <w:r>
-        <w:t>Показать приложение целиком. Четыре карточки — разные рабочие ситуации, а не весь перечень функций. На карточки можно нажать для открытия раздела. Для последовательного выступления достаточно листать дальше.</w:t>
-        <w:br/>
-        <w:br/>
-        <w:t>Переход по щелчку. Изображения PWA реальные; внутри PowerPoint формы не считают. Воспроизведение Morph в Microsoft PowerPoint здесь не проверено.</w:t>
-        <w:br/>
-        <w:t>Фоновая фотографическая иллюстрация создана ИИ; это оформление, не техническая схема и не документальная фотография объекта компании.</w:t>
+        <w:t>Обзор рабочих примеров. Карточки служат только иллюстрациями и не содержат гиперссылок. Продолжайте показ последовательно.</w:t>
       </w:r>
     </w:p>
     <w:p>

</xml_diff>